<commit_message>
Regenerate ShippyPro application package
</commit_message>
<xml_diff>
--- a/registry/jobs/2026-07-24_210330_shippypro_apply-now/application/CV_ValentinNikolaev_shippypro_SeniorSoftwareEngineer.docx
+++ b/registry/jobs/2026-07-24_210330_shippypro_apply-now/application/CV_ValentinNikolaev_shippypro_SeniorSoftwareEngineer.docx
@@ -36,9 +36,9 @@
           <w:szCs w:val="24"/>
           <w:rtl w:val="false"/>
         </w:rPr>
-        <w:t xml:space="preserve">Rome, Italy | +39 351 370 1194 | </w:t>
-      </w:r>
-      <w:hyperlink w:history="1" r:id="rIdhle9ac7vm1cmx51ltsngw">
+        <w:t xml:space="preserve">Rome, Italy | </w:t>
+      </w:r>
+      <w:hyperlink w:history="1" r:id="rIdfg-xa3_txcl5won91x3uw">
         <w:r>
           <w:rPr>
             <w:rFonts w:ascii="Aptos" w:cs="Aptos" w:eastAsia="Aptos" w:hAnsi="Aptos"/>
@@ -59,10 +59,20 @@
           <w:szCs w:val="24"/>
           <w:rtl w:val="false"/>
         </w:rPr>
+        <w:t xml:space="preserve"> | +39 351 370 1194</w:t>
+      </w:r>
+      <w:r>
+        <w:rPr>
+          <w:rFonts w:ascii="Aptos" w:cs="Aptos" w:eastAsia="Aptos" w:hAnsi="Aptos"/>
+          <w:color w:val="000000"/>
+          <w:sz w:val="24"/>
+          <w:szCs w:val="24"/>
+          <w:rtl w:val="false"/>
+        </w:rPr>
         <w:t xml:space="preserve">
 </w:t>
       </w:r>
-      <w:hyperlink w:history="1" r:id="rIdfg7pjgrhwa9l_6tfhwdv2">
+      <w:hyperlink w:history="1" r:id="rIdubvaqjde7erxubbcrzrls">
         <w:r>
           <w:rPr>
             <w:rFonts w:ascii="Aptos" w:cs="Aptos" w:eastAsia="Aptos" w:hAnsi="Aptos"/>
@@ -85,7 +95,7 @@
         </w:rPr>
         <w:t xml:space="preserve"> | </w:t>
       </w:r>
-      <w:hyperlink w:history="1" r:id="rIdkilipu8q-a4w_zri_utkx">
+      <w:hyperlink w:history="1" r:id="rIdyhdqjud1nc5cnwn1tyllq">
         <w:r>
           <w:rPr>
             <w:rFonts w:ascii="Aptos" w:cs="Aptos" w:eastAsia="Aptos" w:hAnsi="Aptos"/>
@@ -133,7 +143,7 @@
           <w:szCs w:val="24"/>
           <w:rtl w:val="false"/>
         </w:rPr>
-        <w:t xml:space="preserve">Senior backend engineer and technical lead with 15+ years of experience building PHP and Go production systems. Deep experience in Laravel, APIs, event-driven and microservice architecture, AWS, Kubernetes, RabbitMQ, MySQL, performance optimization, and operational reliability. Brings hands-on ownership of complex backend services, cross-functional collaboration, and mentoring, with experience in SaaS, automation, e-commerce, and high-volume communications systems.</w:t>
+        <w:t xml:space="preserve">Backend engineer with 15+ years of experience building production systems in PHP and Go. Brings deep Laravel experience, work on microservices and event-driven systems, and a record of improving reliability and performance in SaaS, automation, e-commerce, and communication platforms. Led backend delivery and technical decisions for high-volume services, including a transactional email platform that handled about 50 million messages each month.</w:t>
       </w:r>
     </w:p>
     <w:p>
@@ -170,7 +180,7 @@
           <w:szCs w:val="24"/>
           <w:rtl w:val="false"/>
         </w:rPr>
-        <w:t xml:space="preserve">PHP; Laravel; Go; Symfony; backend APIs; REST APIs; microservices; event-driven systems; system design; AWS; Kubernetes; RabbitMQ; MySQL; PostgreSQL; Elasticsearch; Redis; performance optimization; production reliability; monitoring and logging; Prometheus; GitHub Actions; ArgoCD; Helm; CI/CD; technical leadership; AI and LLM automation systems</w:t>
+        <w:t xml:space="preserve">PHP, Laravel, Go, Symfony, REST APIs, Microservices, Event-Driven Systems, RabbitMQ, AWS, MySQL, PostgreSQL, Elasticsearch, Kubernetes, Docker, GitHub Actions, CI/CD, Prometheus, System Design, Performance Optimization, Production Reliability</w:t>
       </w:r>
     </w:p>
     <w:p>
@@ -209,7 +219,7 @@
           <w:szCs w:val="24"/>
           <w:rtl w:val="false"/>
         </w:rPr>
-        <w:t xml:space="preserve">Simple.life — Software Developer</w:t>
+        <w:t xml:space="preserve">Simple.life | Software Developer</w:t>
       </w:r>
       <w:bookmarkEnd w:id="1"/>
     </w:p>
@@ -227,112 +237,112 @@
           <w:szCs w:val="24"/>
           <w:rtl w:val="false"/>
         </w:rPr>
-        <w:t xml:space="preserve">November 2023 – March 2026 | Remote</w:t>
-      </w:r>
-    </w:p>
-    <w:p>
-      <w:pPr>
-        <w:pStyle w:val="ListParagraph"/>
-        <w:numPr>
-          <w:ilvl w:val="0"/>
-          <w:numId w:val="1"/>
-        </w:numPr>
-        <w:bidi w:val="false"/>
-        <w:spacing w:after="60" w:before="60"/>
-      </w:pPr>
-      <w:r>
-        <w:rPr>
-          <w:rFonts w:ascii="Aptos" w:cs="Aptos" w:eastAsia="Aptos" w:hAnsi="Aptos"/>
-          <w:color w:val="000000"/>
-          <w:sz w:val="24"/>
-          <w:szCs w:val="24"/>
-          <w:rtl w:val="false"/>
-        </w:rPr>
-        <w:t xml:space="preserve">Designed and owned a Go-based support-automation platform integrating Zendesk, Intercom, and internal services.</w:t>
-      </w:r>
-    </w:p>
-    <w:p>
-      <w:pPr>
-        <w:pStyle w:val="ListParagraph"/>
-        <w:numPr>
-          <w:ilvl w:val="0"/>
-          <w:numId w:val="1"/>
-        </w:numPr>
-        <w:bidi w:val="false"/>
-        <w:spacing w:after="60" w:before="60"/>
-      </w:pPr>
-      <w:r>
-        <w:rPr>
-          <w:rFonts w:ascii="Aptos" w:cs="Aptos" w:eastAsia="Aptos" w:hAnsi="Aptos"/>
-          <w:color w:val="000000"/>
-          <w:sz w:val="24"/>
-          <w:szCs w:val="24"/>
-          <w:rtl w:val="false"/>
-        </w:rPr>
-        <w:t xml:space="preserve">Integrated AI-powered auto-triage flows that automated or deflected up to 30% of inbound tickets.</w:t>
-      </w:r>
-    </w:p>
-    <w:p>
-      <w:pPr>
-        <w:pStyle w:val="ListParagraph"/>
-        <w:numPr>
-          <w:ilvl w:val="0"/>
-          <w:numId w:val="1"/>
-        </w:numPr>
-        <w:bidi w:val="false"/>
-        <w:spacing w:after="60" w:before="60"/>
-      </w:pPr>
-      <w:r>
-        <w:rPr>
-          <w:rFonts w:ascii="Aptos" w:cs="Aptos" w:eastAsia="Aptos" w:hAnsi="Aptos"/>
-          <w:color w:val="000000"/>
-          <w:sz w:val="24"/>
-          <w:szCs w:val="24"/>
-          <w:rtl w:val="false"/>
-        </w:rPr>
-        <w:t xml:space="preserve">Migrated business-critical support flows to Intercom's real-time engine, improving routing speed, handling consistency, and operational responsiveness.</w:t>
-      </w:r>
-    </w:p>
-    <w:p>
-      <w:pPr>
-        <w:pStyle w:val="ListParagraph"/>
-        <w:numPr>
-          <w:ilvl w:val="0"/>
-          <w:numId w:val="1"/>
-        </w:numPr>
-        <w:bidi w:val="false"/>
-        <w:spacing w:after="60" w:before="60"/>
-      </w:pPr>
-      <w:r>
-        <w:rPr>
-          <w:rFonts w:ascii="Aptos" w:cs="Aptos" w:eastAsia="Aptos" w:hAnsi="Aptos"/>
-          <w:color w:val="000000"/>
-          <w:sz w:val="24"/>
-          <w:szCs w:val="24"/>
-          <w:rtl w:val="false"/>
-        </w:rPr>
-        <w:t xml:space="preserve">Built resilient message-delivery pipelines with fallback logic, retries, and monitoring to improve reliability during incidents and peak load.</w:t>
-      </w:r>
-    </w:p>
-    <w:p>
-      <w:pPr>
-        <w:pStyle w:val="ListParagraph"/>
-        <w:numPr>
-          <w:ilvl w:val="0"/>
-          <w:numId w:val="1"/>
-        </w:numPr>
-        <w:bidi w:val="false"/>
-        <w:spacing w:after="60" w:before="60"/>
-      </w:pPr>
-      <w:r>
-        <w:rPr>
-          <w:rFonts w:ascii="Aptos" w:cs="Aptos" w:eastAsia="Aptos" w:hAnsi="Aptos"/>
-          <w:color w:val="000000"/>
-          <w:sz w:val="24"/>
-          <w:szCs w:val="24"/>
-          <w:rtl w:val="false"/>
-        </w:rPr>
-        <w:t xml:space="preserve">Contributed to an LLM-assisted support agent for email and multilingual workflows, expanding automation coverage with less engineering involvement.</w:t>
+        <w:t xml:space="preserve">November 2023 - March 2026</w:t>
+      </w:r>
+    </w:p>
+    <w:p>
+      <w:pPr>
+        <w:pStyle w:val="ListParagraph"/>
+        <w:numPr>
+          <w:ilvl w:val="0"/>
+          <w:numId w:val="1"/>
+        </w:numPr>
+        <w:bidi w:val="false"/>
+        <w:spacing w:after="60" w:before="60"/>
+      </w:pPr>
+      <w:r>
+        <w:rPr>
+          <w:rFonts w:ascii="Aptos" w:cs="Aptos" w:eastAsia="Aptos" w:hAnsi="Aptos"/>
+          <w:color w:val="000000"/>
+          <w:sz w:val="24"/>
+          <w:szCs w:val="24"/>
+          <w:rtl w:val="false"/>
+        </w:rPr>
+        <w:t xml:space="preserve">Designed and owned a Go support-automation platform that connected Zendesk, Intercom, and internal services.</w:t>
+      </w:r>
+    </w:p>
+    <w:p>
+      <w:pPr>
+        <w:pStyle w:val="ListParagraph"/>
+        <w:numPr>
+          <w:ilvl w:val="0"/>
+          <w:numId w:val="1"/>
+        </w:numPr>
+        <w:bidi w:val="false"/>
+        <w:spacing w:after="60" w:before="60"/>
+      </w:pPr>
+      <w:r>
+        <w:rPr>
+          <w:rFonts w:ascii="Aptos" w:cs="Aptos" w:eastAsia="Aptos" w:hAnsi="Aptos"/>
+          <w:color w:val="000000"/>
+          <w:sz w:val="24"/>
+          <w:szCs w:val="24"/>
+          <w:rtl w:val="false"/>
+        </w:rPr>
+        <w:t xml:space="preserve">Integrated LLM-powered auto-triage flows that automated or deflected up to 30% of inbound tickets.</w:t>
+      </w:r>
+    </w:p>
+    <w:p>
+      <w:pPr>
+        <w:pStyle w:val="ListParagraph"/>
+        <w:numPr>
+          <w:ilvl w:val="0"/>
+          <w:numId w:val="1"/>
+        </w:numPr>
+        <w:bidi w:val="false"/>
+        <w:spacing w:after="60" w:before="60"/>
+      </w:pPr>
+      <w:r>
+        <w:rPr>
+          <w:rFonts w:ascii="Aptos" w:cs="Aptos" w:eastAsia="Aptos" w:hAnsi="Aptos"/>
+          <w:color w:val="000000"/>
+          <w:sz w:val="24"/>
+          <w:szCs w:val="24"/>
+          <w:rtl w:val="false"/>
+        </w:rPr>
+        <w:t xml:space="preserve">Migrated business-critical support flows from Zendesk to Intercom's real-time engine, improving routing speed and handling consistency.</w:t>
+      </w:r>
+    </w:p>
+    <w:p>
+      <w:pPr>
+        <w:pStyle w:val="ListParagraph"/>
+        <w:numPr>
+          <w:ilvl w:val="0"/>
+          <w:numId w:val="1"/>
+        </w:numPr>
+        <w:bidi w:val="false"/>
+        <w:spacing w:after="60" w:before="60"/>
+      </w:pPr>
+      <w:r>
+        <w:rPr>
+          <w:rFonts w:ascii="Aptos" w:cs="Aptos" w:eastAsia="Aptos" w:hAnsi="Aptos"/>
+          <w:color w:val="000000"/>
+          <w:sz w:val="24"/>
+          <w:szCs w:val="24"/>
+          <w:rtl w:val="false"/>
+        </w:rPr>
+        <w:t xml:space="preserve">Built message-delivery pipelines with fallback logic, retries, and monitoring to improve reliability during incidents and peak load.</w:t>
+      </w:r>
+    </w:p>
+    <w:p>
+      <w:pPr>
+        <w:pStyle w:val="ListParagraph"/>
+        <w:numPr>
+          <w:ilvl w:val="0"/>
+          <w:numId w:val="1"/>
+        </w:numPr>
+        <w:bidi w:val="false"/>
+        <w:spacing w:after="60" w:before="60"/>
+      </w:pPr>
+      <w:r>
+        <w:rPr>
+          <w:rFonts w:ascii="Aptos" w:cs="Aptos" w:eastAsia="Aptos" w:hAnsi="Aptos"/>
+          <w:color w:val="000000"/>
+          <w:sz w:val="24"/>
+          <w:szCs w:val="24"/>
+          <w:rtl w:val="false"/>
+        </w:rPr>
+        <w:t xml:space="preserve">Contributed to an LLM-assisted support agent for email and multilingual workflows, which expanded automation coverage for the support team.</w:t>
       </w:r>
     </w:p>
     <w:p>
@@ -342,16 +352,16 @@
         <w:bidi w:val="false"/>
         <w:spacing w:after="120" w:before="240"/>
       </w:pPr>
-      <w:bookmarkStart w:name="_Toc_airSlate_Software_Developer_Technical_Le_6" w:id="1"/>
-      <w:r>
-        <w:rPr>
-          <w:rFonts w:ascii="Aptos" w:cs="Aptos" w:eastAsia="Aptos" w:hAnsi="Aptos"/>
-          <w:color w:val="000000"/>
-          <w:sz w:val="24"/>
-          <w:szCs w:val="24"/>
-          <w:rtl w:val="false"/>
-        </w:rPr>
-        <w:t xml:space="preserve">airSlate — Software Developer / Technical Lead</w:t>
+      <w:bookmarkStart w:name="_Toc_airSlate_Software_Developer_6" w:id="1"/>
+      <w:r>
+        <w:rPr>
+          <w:rFonts w:ascii="Aptos" w:cs="Aptos" w:eastAsia="Aptos" w:hAnsi="Aptos"/>
+          <w:color w:val="000000"/>
+          <w:sz w:val="24"/>
+          <w:szCs w:val="24"/>
+          <w:rtl w:val="false"/>
+        </w:rPr>
+        <w:t xml:space="preserve">airSlate | Software Developer</w:t>
       </w:r>
       <w:bookmarkEnd w:id="1"/>
     </w:p>
@@ -369,7 +379,7 @@
           <w:szCs w:val="24"/>
           <w:rtl w:val="false"/>
         </w:rPr>
-        <w:t xml:space="preserve">February 2021 – August 2023 | Kyiv, Ukraine</w:t>
+        <w:t xml:space="preserve">February 2021 - August 2023</w:t>
       </w:r>
     </w:p>
     <w:p>
@@ -411,7 +421,7 @@
           <w:szCs w:val="24"/>
           <w:rtl w:val="false"/>
         </w:rPr>
-        <w:t xml:space="preserve">Investigated and addressed API and query-performance bottlenecks across backend services.</w:t>
+        <w:t xml:space="preserve">Investigated API and query performance bottlenecks across backend services and delivered targeted fixes.</w:t>
       </w:r>
     </w:p>
     <w:p>
@@ -453,27 +463,6 @@
           <w:szCs w:val="24"/>
           <w:rtl w:val="false"/>
         </w:rPr>
-        <w:t xml:space="preserve">Developed a Laravel/Symfony product-wide logger package aligned with interservice communication standards.</w:t>
-      </w:r>
-    </w:p>
-    <w:p>
-      <w:pPr>
-        <w:pStyle w:val="ListParagraph"/>
-        <w:numPr>
-          <w:ilvl w:val="0"/>
-          <w:numId w:val="1"/>
-        </w:numPr>
-        <w:bidi w:val="false"/>
-        <w:spacing w:after="60" w:before="60"/>
-      </w:pPr>
-      <w:r>
-        <w:rPr>
-          <w:rFonts w:ascii="Aptos" w:cs="Aptos" w:eastAsia="Aptos" w:hAnsi="Aptos"/>
-          <w:color w:val="000000"/>
-          <w:sz w:val="24"/>
-          <w:szCs w:val="24"/>
-          <w:rtl w:val="false"/>
-        </w:rPr>
         <w:t xml:space="preserve">Implemented CI/CD pipelines that shortened release cycles and improved delivery consistency.</w:t>
       </w:r>
     </w:p>
@@ -495,28 +484,7 @@
           <w:szCs w:val="24"/>
           <w:rtl w:val="false"/>
         </w:rPr>
-        <w:t xml:space="preserve">Troubleshot production issues using logs, monitoring, and SRE dashboards, delivering operational improvements.</w:t>
-      </w:r>
-    </w:p>
-    <w:p>
-      <w:pPr>
-        <w:pStyle w:val="ListParagraph"/>
-        <w:numPr>
-          <w:ilvl w:val="0"/>
-          <w:numId w:val="1"/>
-        </w:numPr>
-        <w:bidi w:val="false"/>
-        <w:spacing w:after="60" w:before="60"/>
-      </w:pPr>
-      <w:r>
-        <w:rPr>
-          <w:rFonts w:ascii="Aptos" w:cs="Aptos" w:eastAsia="Aptos" w:hAnsi="Aptos"/>
-          <w:color w:val="000000"/>
-          <w:sz w:val="24"/>
-          <w:szCs w:val="24"/>
-          <w:rtl w:val="false"/>
-        </w:rPr>
-        <w:t xml:space="preserve">Led Agile planning, delivery coordination, technical interviews, and team development as Technical Lead.</w:t>
+        <w:t xml:space="preserve">Troubleshot production issues through logs, monitoring, and SRE dashboards; delivered operational improvements.</w:t>
       </w:r>
     </w:p>
     <w:p>
@@ -535,7 +503,7 @@
           <w:szCs w:val="24"/>
           <w:rtl w:val="false"/>
         </w:rPr>
-        <w:t xml:space="preserve">Hyprr — Technical Lead</w:t>
+        <w:t xml:space="preserve">Hyprr | Technical Lead</w:t>
       </w:r>
       <w:bookmarkEnd w:id="1"/>
     </w:p>
@@ -553,70 +521,91 @@
           <w:szCs w:val="24"/>
           <w:rtl w:val="false"/>
         </w:rPr>
-        <w:t xml:space="preserve">November 2019 – January 2021</w:t>
-      </w:r>
-    </w:p>
-    <w:p>
-      <w:pPr>
-        <w:pStyle w:val="ListParagraph"/>
-        <w:numPr>
-          <w:ilvl w:val="0"/>
-          <w:numId w:val="1"/>
-        </w:numPr>
-        <w:bidi w:val="false"/>
-        <w:spacing w:after="60" w:before="60"/>
-      </w:pPr>
-      <w:r>
-        <w:rPr>
-          <w:rFonts w:ascii="Aptos" w:cs="Aptos" w:eastAsia="Aptos" w:hAnsi="Aptos"/>
-          <w:color w:val="000000"/>
-          <w:sz w:val="24"/>
-          <w:szCs w:val="24"/>
-          <w:rtl w:val="false"/>
-        </w:rPr>
-        <w:t xml:space="preserve">Helped bring a creator-focused digital platform from prototype to closed beta in under six months.</w:t>
-      </w:r>
-    </w:p>
-    <w:p>
-      <w:pPr>
-        <w:pStyle w:val="ListParagraph"/>
-        <w:numPr>
-          <w:ilvl w:val="0"/>
-          <w:numId w:val="1"/>
-        </w:numPr>
-        <w:bidi w:val="false"/>
-        <w:spacing w:after="60" w:before="60"/>
-      </w:pPr>
-      <w:r>
-        <w:rPr>
-          <w:rFonts w:ascii="Aptos" w:cs="Aptos" w:eastAsia="Aptos" w:hAnsi="Aptos"/>
-          <w:color w:val="000000"/>
-          <w:sz w:val="24"/>
-          <w:szCs w:val="24"/>
-          <w:rtl w:val="false"/>
-        </w:rPr>
-        <w:t xml:space="preserve">Defined the technology roadmap with the CTO and shaped product delivery across microservice and serverless architecture, CI/CD, and reliability concerns.</w:t>
-      </w:r>
-    </w:p>
-    <w:p>
-      <w:pPr>
-        <w:pStyle w:val="ListParagraph"/>
-        <w:numPr>
-          <w:ilvl w:val="0"/>
-          <w:numId w:val="1"/>
-        </w:numPr>
-        <w:bidi w:val="false"/>
-        <w:spacing w:after="60" w:before="60"/>
-      </w:pPr>
-      <w:r>
-        <w:rPr>
-          <w:rFonts w:ascii="Aptos" w:cs="Aptos" w:eastAsia="Aptos" w:hAnsi="Aptos"/>
-          <w:color w:val="000000"/>
-          <w:sz w:val="24"/>
-          <w:szCs w:val="24"/>
-          <w:rtl w:val="false"/>
-        </w:rPr>
-        <w:t xml:space="preserve">Led backend development and worked with product and technical stakeholders on planning and objectives.</w:t>
+        <w:t xml:space="preserve">November 2019 - January 2021</w:t>
+      </w:r>
+    </w:p>
+    <w:p>
+      <w:pPr>
+        <w:pStyle w:val="ListParagraph"/>
+        <w:numPr>
+          <w:ilvl w:val="0"/>
+          <w:numId w:val="1"/>
+        </w:numPr>
+        <w:bidi w:val="false"/>
+        <w:spacing w:after="60" w:before="60"/>
+      </w:pPr>
+      <w:r>
+        <w:rPr>
+          <w:rFonts w:ascii="Aptos" w:cs="Aptos" w:eastAsia="Aptos" w:hAnsi="Aptos"/>
+          <w:color w:val="000000"/>
+          <w:sz w:val="24"/>
+          <w:szCs w:val="24"/>
+          <w:rtl w:val="false"/>
+        </w:rPr>
+        <w:t xml:space="preserve">Took a creator-focused digital platform from prototype to closed beta in under six months.</w:t>
+      </w:r>
+    </w:p>
+    <w:p>
+      <w:pPr>
+        <w:pStyle w:val="ListParagraph"/>
+        <w:numPr>
+          <w:ilvl w:val="0"/>
+          <w:numId w:val="1"/>
+        </w:numPr>
+        <w:bidi w:val="false"/>
+        <w:spacing w:after="60" w:before="60"/>
+      </w:pPr>
+      <w:r>
+        <w:rPr>
+          <w:rFonts w:ascii="Aptos" w:cs="Aptos" w:eastAsia="Aptos" w:hAnsi="Aptos"/>
+          <w:color w:val="000000"/>
+          <w:sz w:val="24"/>
+          <w:szCs w:val="24"/>
+          <w:rtl w:val="false"/>
+        </w:rPr>
+        <w:t xml:space="preserve">Shaped product delivery across planning, microservice and serverless architecture, CI/CD, and reliability concerns.</w:t>
+      </w:r>
+    </w:p>
+    <w:p>
+      <w:pPr>
+        <w:pStyle w:val="ListParagraph"/>
+        <w:numPr>
+          <w:ilvl w:val="0"/>
+          <w:numId w:val="1"/>
+        </w:numPr>
+        <w:bidi w:val="false"/>
+        <w:spacing w:after="60" w:before="60"/>
+      </w:pPr>
+      <w:r>
+        <w:rPr>
+          <w:rFonts w:ascii="Aptos" w:cs="Aptos" w:eastAsia="Aptos" w:hAnsi="Aptos"/>
+          <w:color w:val="000000"/>
+          <w:sz w:val="24"/>
+          <w:szCs w:val="24"/>
+          <w:rtl w:val="false"/>
+        </w:rPr>
+        <w:t xml:space="preserve">Defined the technology roadmap with the CTO and established the core stack for product delivery.</w:t>
+      </w:r>
+    </w:p>
+    <w:p>
+      <w:pPr>
+        <w:pStyle w:val="ListParagraph"/>
+        <w:numPr>
+          <w:ilvl w:val="0"/>
+          <w:numId w:val="1"/>
+        </w:numPr>
+        <w:bidi w:val="false"/>
+        <w:spacing w:after="60" w:before="60"/>
+      </w:pPr>
+      <w:r>
+        <w:rPr>
+          <w:rFonts w:ascii="Aptos" w:cs="Aptos" w:eastAsia="Aptos" w:hAnsi="Aptos"/>
+          <w:color w:val="000000"/>
+          <w:sz w:val="24"/>
+          <w:szCs w:val="24"/>
+          <w:rtl w:val="false"/>
+        </w:rPr>
+        <w:t xml:space="preserve">Led backend development for the platform's Ethereum-based digital-asset components.</w:t>
       </w:r>
     </w:p>
     <w:p>
@@ -626,16 +615,16 @@
         <w:bidi w:val="false"/>
         <w:spacing w:after="120" w:before="240"/>
       </w:pPr>
-      <w:bookmarkStart w:name="_Toc_PDFfiller_Software_Developer_Technical_L_8" w:id="1"/>
-      <w:r>
-        <w:rPr>
-          <w:rFonts w:ascii="Aptos" w:cs="Aptos" w:eastAsia="Aptos" w:hAnsi="Aptos"/>
-          <w:color w:val="000000"/>
-          <w:sz w:val="24"/>
-          <w:szCs w:val="24"/>
-          <w:rtl w:val="false"/>
-        </w:rPr>
-        <w:t xml:space="preserve">PDFfiller — Software Developer / Technical Lead</w:t>
+      <w:bookmarkStart w:name="_Toc_PDFfiller_Software_Developer_8" w:id="1"/>
+      <w:r>
+        <w:rPr>
+          <w:rFonts w:ascii="Aptos" w:cs="Aptos" w:eastAsia="Aptos" w:hAnsi="Aptos"/>
+          <w:color w:val="000000"/>
+          <w:sz w:val="24"/>
+          <w:szCs w:val="24"/>
+          <w:rtl w:val="false"/>
+        </w:rPr>
+        <w:t xml:space="preserve">PDFfiller | Software Developer</w:t>
       </w:r>
       <w:bookmarkEnd w:id="1"/>
     </w:p>
@@ -653,89 +642,110 @@
           <w:szCs w:val="24"/>
           <w:rtl w:val="false"/>
         </w:rPr>
-        <w:t xml:space="preserve">October 2016 – November 2019</w:t>
-      </w:r>
-    </w:p>
-    <w:p>
-      <w:pPr>
-        <w:pStyle w:val="ListParagraph"/>
-        <w:numPr>
-          <w:ilvl w:val="0"/>
-          <w:numId w:val="1"/>
-        </w:numPr>
-        <w:bidi w:val="false"/>
-        <w:spacing w:after="60" w:before="60"/>
-      </w:pPr>
-      <w:r>
-        <w:rPr>
-          <w:rFonts w:ascii="Aptos" w:cs="Aptos" w:eastAsia="Aptos" w:hAnsi="Aptos"/>
-          <w:color w:val="000000"/>
-          <w:sz w:val="24"/>
-          <w:szCs w:val="24"/>
-          <w:rtl w:val="false"/>
-        </w:rPr>
-        <w:t xml:space="preserve">Led a team of five backend engineers developing a transactional-email service.</w:t>
-      </w:r>
-    </w:p>
-    <w:p>
-      <w:pPr>
-        <w:pStyle w:val="ListParagraph"/>
-        <w:numPr>
-          <w:ilvl w:val="0"/>
-          <w:numId w:val="1"/>
-        </w:numPr>
-        <w:bidi w:val="false"/>
-        <w:spacing w:after="60" w:before="60"/>
-      </w:pPr>
-      <w:r>
-        <w:rPr>
-          <w:rFonts w:ascii="Aptos" w:cs="Aptos" w:eastAsia="Aptos" w:hAnsi="Aptos"/>
-          <w:color w:val="000000"/>
-          <w:sz w:val="24"/>
-          <w:szCs w:val="24"/>
-          <w:rtl w:val="false"/>
-        </w:rPr>
-        <w:t xml:space="preserve">Scaled the service to around 50 million emails per month and supported BFCM periods with more than 10x traffic growth.</w:t>
-      </w:r>
-    </w:p>
-    <w:p>
-      <w:pPr>
-        <w:pStyle w:val="ListParagraph"/>
-        <w:numPr>
-          <w:ilvl w:val="0"/>
-          <w:numId w:val="1"/>
-        </w:numPr>
-        <w:bidi w:val="false"/>
-        <w:spacing w:after="60" w:before="60"/>
-      </w:pPr>
-      <w:r>
-        <w:rPr>
-          <w:rFonts w:ascii="Aptos" w:cs="Aptos" w:eastAsia="Aptos" w:hAnsi="Aptos"/>
-          <w:color w:val="000000"/>
-          <w:sz w:val="24"/>
-          <w:szCs w:val="24"/>
-          <w:rtl w:val="false"/>
-        </w:rPr>
-        <w:t xml:space="preserve">Made key technical decisions and developed expertise in email infrastructure, including DNS, DKIM, SPF, DMARC, and feedback loops.</w:t>
-      </w:r>
-    </w:p>
-    <w:p>
-      <w:pPr>
-        <w:pStyle w:val="3"/>
-        <w:pStyle w:val="Heading3"/>
+        <w:t xml:space="preserve">October 2016 - November 2019</w:t>
+      </w:r>
+    </w:p>
+    <w:p>
+      <w:pPr>
+        <w:pStyle w:val="ListParagraph"/>
+        <w:numPr>
+          <w:ilvl w:val="0"/>
+          <w:numId w:val="1"/>
+        </w:numPr>
+        <w:bidi w:val="false"/>
+        <w:spacing w:after="60" w:before="60"/>
+      </w:pPr>
+      <w:r>
+        <w:rPr>
+          <w:rFonts w:ascii="Aptos" w:cs="Aptos" w:eastAsia="Aptos" w:hAnsi="Aptos"/>
+          <w:color w:val="000000"/>
+          <w:sz w:val="24"/>
+          <w:szCs w:val="24"/>
+          <w:rtl w:val="false"/>
+        </w:rPr>
+        <w:t xml:space="preserve">Led a team of five backend engineers building a transactional email service.</w:t>
+      </w:r>
+    </w:p>
+    <w:p>
+      <w:pPr>
+        <w:pStyle w:val="ListParagraph"/>
+        <w:numPr>
+          <w:ilvl w:val="0"/>
+          <w:numId w:val="1"/>
+        </w:numPr>
+        <w:bidi w:val="false"/>
+        <w:spacing w:after="60" w:before="60"/>
+      </w:pPr>
+      <w:r>
+        <w:rPr>
+          <w:rFonts w:ascii="Aptos" w:cs="Aptos" w:eastAsia="Aptos" w:hAnsi="Aptos"/>
+          <w:color w:val="000000"/>
+          <w:sz w:val="24"/>
+          <w:szCs w:val="24"/>
+          <w:rtl w:val="false"/>
+        </w:rPr>
+        <w:t xml:space="preserve">Scaled the service to about 50 million emails per month.</w:t>
+      </w:r>
+    </w:p>
+    <w:p>
+      <w:pPr>
+        <w:pStyle w:val="ListParagraph"/>
+        <w:numPr>
+          <w:ilvl w:val="0"/>
+          <w:numId w:val="1"/>
+        </w:numPr>
+        <w:bidi w:val="false"/>
+        <w:spacing w:after="60" w:before="60"/>
+      </w:pPr>
+      <w:r>
+        <w:rPr>
+          <w:rFonts w:ascii="Aptos" w:cs="Aptos" w:eastAsia="Aptos" w:hAnsi="Aptos"/>
+          <w:color w:val="000000"/>
+          <w:sz w:val="24"/>
+          <w:szCs w:val="24"/>
+          <w:rtl w:val="false"/>
+        </w:rPr>
+        <w:t xml:space="preserve">Made technical decisions for messaging infrastructure, including DNS, DKIM, SPF, DMARC, and feedback loops.</w:t>
+      </w:r>
+    </w:p>
+    <w:p>
+      <w:pPr>
+        <w:pStyle w:val="ListParagraph"/>
+        <w:numPr>
+          <w:ilvl w:val="0"/>
+          <w:numId w:val="1"/>
+        </w:numPr>
+        <w:bidi w:val="false"/>
+        <w:spacing w:after="60" w:before="60"/>
+      </w:pPr>
+      <w:r>
+        <w:rPr>
+          <w:rFonts w:ascii="Aptos" w:cs="Aptos" w:eastAsia="Aptos" w:hAnsi="Aptos"/>
+          <w:color w:val="000000"/>
+          <w:sz w:val="24"/>
+          <w:szCs w:val="24"/>
+          <w:rtl w:val="false"/>
+        </w:rPr>
+        <w:t xml:space="preserve">Led the team through BFCM peak periods with more than tenfold traffic growth.</w:t>
+      </w:r>
+    </w:p>
+    <w:p>
+      <w:pPr>
+        <w:pStyle w:val="2"/>
+        <w:pStyle w:val="Heading2"/>
         <w:bidi w:val="false"/>
         <w:spacing w:after="120" w:before="240"/>
       </w:pPr>
-      <w:bookmarkStart w:name="_Toc_Earlier_Backend_Experience_9" w:id="1"/>
-      <w:r>
-        <w:rPr>
-          <w:rFonts w:ascii="Aptos" w:cs="Aptos" w:eastAsia="Aptos" w:hAnsi="Aptos"/>
-          <w:color w:val="000000"/>
-          <w:sz w:val="24"/>
-          <w:szCs w:val="24"/>
-          <w:rtl w:val="false"/>
-        </w:rPr>
-        <w:t xml:space="preserve">Earlier Backend Experience</w:t>
+      <w:bookmarkStart w:name="_Toc_Education_9" w:id="1"/>
+      <w:r>
+        <w:rPr>
+          <w:rFonts w:ascii="Aptos" w:cs="Aptos" w:eastAsia="Aptos" w:hAnsi="Aptos"/>
+          <w:color w:val="000000"/>
+          <w:sz w:val="28"/>
+          <w:szCs w:val="28"/>
+          <w:rtl w:val="false"/>
+        </w:rPr>
+        <w:t xml:space="preserve">Education</w:t>
       </w:r>
       <w:bookmarkEnd w:id="1"/>
     </w:p>
@@ -753,8 +763,28 @@
           <w:szCs w:val="24"/>
           <w:rtl w:val="false"/>
         </w:rPr>
-        <w:t xml:space="preserve">2008 – 2016</w:t>
-      </w:r>
+        <w:t xml:space="preserve">MSc in Computer Science, National Technical University, Kharkiv, Ukraine | 2003 - 2008</w:t>
+      </w:r>
+    </w:p>
+    <w:p>
+      <w:pPr>
+        <w:pStyle w:val="2"/>
+        <w:pStyle w:val="Heading2"/>
+        <w:bidi w:val="false"/>
+        <w:spacing w:after="120" w:before="240"/>
+      </w:pPr>
+      <w:bookmarkStart w:name="_Toc_Languages_10" w:id="1"/>
+      <w:r>
+        <w:rPr>
+          <w:rFonts w:ascii="Aptos" w:cs="Aptos" w:eastAsia="Aptos" w:hAnsi="Aptos"/>
+          <w:color w:val="000000"/>
+          <w:sz w:val="28"/>
+          <w:szCs w:val="28"/>
+          <w:rtl w:val="false"/>
+        </w:rPr>
+        <w:t xml:space="preserve">Languages</w:t>
+      </w:r>
+      <w:bookmarkEnd w:id="1"/>
     </w:p>
     <w:p>
       <w:pPr>
@@ -770,44 +800,7 @@
           <w:szCs w:val="24"/>
           <w:rtl w:val="false"/>
         </w:rPr>
-        <w:t xml:space="preserve">Senior Software Developer roles at Sixt, Aurum Software, CoinsBank/bit-x, and freelance engagements. Delivered PHP backend services, payment integrations, event-driven notifications, database optimization, REST APIs, code reviews, and production troubleshooting.</w:t>
-      </w:r>
-    </w:p>
-    <w:p>
-      <w:pPr>
-        <w:pStyle w:val="2"/>
-        <w:pStyle w:val="Heading2"/>
-        <w:bidi w:val="false"/>
-        <w:spacing w:after="120" w:before="240"/>
-      </w:pPr>
-      <w:bookmarkStart w:name="_Toc_Education_10" w:id="1"/>
-      <w:r>
-        <w:rPr>
-          <w:rFonts w:ascii="Aptos" w:cs="Aptos" w:eastAsia="Aptos" w:hAnsi="Aptos"/>
-          <w:color w:val="000000"/>
-          <w:sz w:val="28"/>
-          <w:szCs w:val="28"/>
-          <w:rtl w:val="false"/>
-        </w:rPr>
-        <w:t xml:space="preserve">Education</w:t>
-      </w:r>
-      <w:bookmarkEnd w:id="1"/>
-    </w:p>
-    <w:p>
-      <w:pPr>
-        <w:bidi w:val="false"/>
-        <w:spacing w:after="120" w:before="120" w:line="259.20000000000005"/>
-        <w:jc w:val="left"/>
-      </w:pPr>
-      <w:r>
-        <w:rPr>
-          <w:rFonts w:ascii="Aptos" w:cs="Aptos" w:eastAsia="Aptos" w:hAnsi="Aptos"/>
-          <w:color w:val="000000"/>
-          <w:sz w:val="24"/>
-          <w:szCs w:val="24"/>
-          <w:rtl w:val="false"/>
-        </w:rPr>
-        <w:t xml:space="preserve">Master of Computer Applications, Microprocessors, C, ASM, IT Management</w:t>
+        <w:t xml:space="preserve">Ukrainian: Native</w:t>
       </w:r>
       <w:r>
         <w:rPr>
@@ -828,65 +821,7 @@
           <w:szCs w:val="24"/>
           <w:rtl w:val="false"/>
         </w:rPr>
-        <w:t xml:space="preserve">National Technical University “Kharkiv Polytechnic Institute” | 2003 – 2008</w:t>
-      </w:r>
-    </w:p>
-    <w:p>
-      <w:pPr>
-        <w:pStyle w:val="2"/>
-        <w:pStyle w:val="Heading2"/>
-        <w:bidi w:val="false"/>
-        <w:spacing w:after="120" w:before="240"/>
-      </w:pPr>
-      <w:bookmarkStart w:name="_Toc_Languages_11" w:id="1"/>
-      <w:r>
-        <w:rPr>
-          <w:rFonts w:ascii="Aptos" w:cs="Aptos" w:eastAsia="Aptos" w:hAnsi="Aptos"/>
-          <w:color w:val="000000"/>
-          <w:sz w:val="28"/>
-          <w:szCs w:val="28"/>
-          <w:rtl w:val="false"/>
-        </w:rPr>
-        <w:t xml:space="preserve">Languages</w:t>
-      </w:r>
-      <w:bookmarkEnd w:id="1"/>
-    </w:p>
-    <w:p>
-      <w:pPr>
-        <w:bidi w:val="false"/>
-        <w:spacing w:after="120" w:before="120" w:line="259.20000000000005"/>
-        <w:jc w:val="left"/>
-      </w:pPr>
-      <w:r>
-        <w:rPr>
-          <w:rFonts w:ascii="Aptos" w:cs="Aptos" w:eastAsia="Aptos" w:hAnsi="Aptos"/>
-          <w:color w:val="000000"/>
-          <w:sz w:val="24"/>
-          <w:szCs w:val="24"/>
-          <w:rtl w:val="false"/>
-        </w:rPr>
-        <w:t xml:space="preserve">Ukrainian — Native</w:t>
-      </w:r>
-      <w:r>
-        <w:rPr>
-          <w:rFonts w:ascii="Aptos" w:cs="Aptos" w:eastAsia="Aptos" w:hAnsi="Aptos"/>
-          <w:color w:val="000000"/>
-          <w:sz w:val="24"/>
-          <w:szCs w:val="24"/>
-          <w:rtl w:val="false"/>
-        </w:rPr>
-        <w:t xml:space="preserve">
-</w:t>
-      </w:r>
-      <w:r>
-        <w:rPr>
-          <w:rFonts w:ascii="Aptos" w:cs="Aptos" w:eastAsia="Aptos" w:hAnsi="Aptos"/>
-          <w:color w:val="000000"/>
-          <w:sz w:val="24"/>
-          <w:szCs w:val="24"/>
-          <w:rtl w:val="false"/>
-        </w:rPr>
-        <w:t xml:space="preserve">English — Upper-intermediate / Professional working proficiency</w:t>
+        <w:t xml:space="preserve">English: Upper-intermediate</w:t>
       </w:r>
     </w:p>
     <w:sectPr>

</xml_diff>